<commit_message>
Strengthen psychological safety: leaders' poster, retro safety check, scenarios
- Leading for Psychological Safety poster and guide: set the stage,
  invite participation, respond productively; safety and standards grid;
  phrases, daily habits and warning signs (inspired by Amy Edmondson)
- Retro guides open with the Prime Directive and an anonymous safety
  check (1–5 or ESVP)
- Three new playbook scenarios; glossary adds Prime Directive, ESVP and
  learning zone; roles, home page and README updated

Co-Authored-By: Claude Opus 5.5 <noreply@anthropic.com>
</commit_message>
<xml_diff>
--- a/facilitator-guide-psych-safety.docx
+++ b/facilitator-guide-psych-safety.docx
@@ -764,6 +764,17 @@
         <w:rPr>
           <w:b/>
         </w:rPr>
+        <w:t xml:space="preserve">Safety isn't comfort. </w:t>
+      </w:r>
+      <w:r>
+        <w:t xml:space="preserve">High safety with low standards is a comfort zone. Aim for the learning zone: safe to speak up, and high standards.</w:t>
+      </w:r>
+    </w:p>
+    <w:p>
+      <w:r>
+        <w:rPr>
+          <w:b/>
+        </w:rPr>
         <w:t xml:space="preserve">Common pitfalls: </w:t>
       </w:r>
       <w:r>
@@ -850,7 +861,13 @@
         <w:t xml:space="preserve">Coaching Conversation</w:t>
       </w:r>
       <w:r>
-        <w:t xml:space="preserve"> canvas for one-to-one follow-up.</w:t>
+        <w:t xml:space="preserve"> canvas for one-to-one follow-up. Leaders can use the </w:t>
+      </w:r>
+      <w:r>
+        <w:t xml:space="preserve">Leading for Psychological Safety</w:t>
+      </w:r>
+      <w:r>
+        <w:t xml:space="preserve"> poster for daily habits.</w:t>
       </w:r>
     </w:p>
     <w:p>

</xml_diff>